<commit_message>
The Council leaves the admin console and moves to the floor
The EVENTS › COUNCIL tab goes — call and end, the sitting clock, the
Continuity Order picker, the no-order block, the last order — and so do
the CALL COUNCIL quick action, the CALL COUNCIL pressure dial, the
council settings rows and the scripted council beats in both scenarios.
The rolling blackout keeps its pressure dial and gains a status line
with END BLACKOUT on the same tab.

A sitting is now called on the floor: out loud, with the COUNCIL
SUMMONED alert on every screen and the facilitator's own three-minute
clock; the Continuity Order is applied by hand with the BROWNOUT quick
action, or a rolling blackout when no order arrives. The guidebook
beats, README and the message contract say so; guidebook and manifest
rebuilt. The engine, the server intents, the wall and sector banners
and the analysis stay for scripts, the demo and tests.

Co-Authored-By: Claude Fable 5.1 <noreply@anthropic.com>
</commit_message>
<xml_diff>
--- a/kit/UNDERCITY_Facilitator_Guidebook.docx
+++ b/kit/UNDERCITY_Facilitator_Guidebook.docx
@@ -6508,7 +6508,7 @@
               <w:rPr>
                 <w:rFonts w:ascii="Arial" w:cs="Arial" w:eastAsia="Arial" w:hAnsi="Arial"/>
               </w:rPr>
-              <w:t xml:space="preserve">CALL COUNCIL. Three-minute clock. Chiefs and liaisons to the centre table — the rest of the city keeps running.</w:t>
+              <w:t xml:space="preserve">Call Council out loud and put the COUNCIL SUMMONED alert on every screen. Run the three minutes on your own clock. Chiefs and liaisons to the centre table — the rest of the city keeps running.</w:t>
             </w:r>
           </w:p>
         </w:tc>
@@ -6579,7 +6579,7 @@
               <w:rPr>
                 <w:rFonts w:ascii="Arial" w:cs="Arial" w:eastAsia="Arial" w:hAnsi="Arial"/>
               </w:rPr>
-              <w:t xml:space="preserve">Council ends.</w:t>
+              <w:t xml:space="preserve">Council ends. Dismiss the alert.</w:t>
             </w:r>
           </w:p>
         </w:tc>
@@ -7370,7 +7370,7 @@
               <w:rPr>
                 <w:rFonts w:ascii="Arial" w:cs="Arial" w:eastAsia="Arial" w:hAnsi="Arial"/>
               </w:rPr>
-              <w:t xml:space="preserve">CALL COUNCIL. Announce the Continuity Order is due. Place the form on the centre table.</w:t>
+              <w:t xml:space="preserve">Call Council out loud, alert CONTINUITY ORDER REQUIRED, and run the three minutes on your own clock. Announce the Continuity Order is due. Place the form on the centre table.</w:t>
             </w:r>
           </w:p>
         </w:tc>
@@ -7512,7 +7512,7 @@
               <w:rPr>
                 <w:rFonts w:ascii="Arial" w:cs="Arial" w:eastAsia="Arial" w:hAnsi="Arial"/>
               </w:rPr>
-              <w:t xml:space="preserve">If the form is submitted: apply brownout to the two lowest-ranked sectors. If not: announce rolling blackouts across all six.</w:t>
+              <w:t xml:space="preserve">If the form is submitted: put the two lowest-ranked sectors into BROWNOUT (the quick action, one sector at a time). If not: announce rolling blackouts and start ROLLING BLACKOUT from EVENTS › PRESSURE.</w:t>
             </w:r>
           </w:p>
         </w:tc>

</xml_diff>

<commit_message>
Every fault is the facilitator's hand
No fault fires on its own any more. A round button changes the round,
loads its timer READY and charges the outgoing round's upkeep; it deals
nothing. A timeline fault beat marked AUTO goes READY and waits for the
press like a MANUAL one. A fault reaching the scheduled queue is dropped
and logged (fault_auto_trigger_dropped); a preset fires only its
immediate items and logs its delayed ones the same way. The run opens
with an empty board: startFirstRound only stamps Round 0 activated.

The round on a content fault is now the library's grouping, the
facilitator's guide to which faults belong where, not a trigger. A
restart of the current round still puts back to active whatever of its
faults the facilitator has already fired, and still makes no record.

Admin confirms, the contract, the README and the guidebook's runbook
beats say so; the engine, integration and reference-chain suites pin it.

Co-Authored-By: Claude Fable 5.1 <noreply@anthropic.com>
</commit_message>
<xml_diff>
--- a/kit/UNDERCITY_Facilitator_Guidebook.docx
+++ b/kit/UNDERCITY_Facilitator_Guidebook.docx
@@ -5517,7 +5517,7 @@
               <w:rPr>
                 <w:rFonts w:ascii="Arial" w:cs="Arial" w:eastAsia="Arial" w:hAnsi="Arial"/>
               </w:rPr>
-              <w:t xml:space="preserve">Activate ROUND 0 on the console: its six tutorial faults F-001 to F-006 land at once, one per sector. Hand the cards.</w:t>
+              <w:t xml:space="preserve">Fire the six tutorial faults F-001 to F-006 from the fault library on the control panel, one per sector, and hand the cards. No round button deals a fault: every fault in this shift is fired by you.</w:t>
             </w:r>
           </w:p>
         </w:tc>
@@ -5959,7 +5959,7 @@
               <w:rPr>
                 <w:rFonts w:ascii="Arial" w:cs="Arial" w:eastAsia="Arial" w:hAnsi="Arial"/>
               </w:rPr>
-              <w:t xml:space="preserve">NEXT ROUND → Round 1: its six faults land at once, one per sector. START the clock. Announce: routine shift, standard faults.</w:t>
+              <w:t xml:space="preserve">NEXT ROUND → Round 1. START the clock. Then fire the round's six faults F-101 to F-106 from the library, one per sector, as fast or as slowly as the room can take them. Announce: routine shift, standard faults.</w:t>
             </w:r>
           </w:p>
         </w:tc>
@@ -6446,7 +6446,7 @@
               <w:rPr>
                 <w:rFonts w:ascii="Arial" w:cs="Arial" w:eastAsia="Arial" w:hAnsi="Arial"/>
               </w:rPr>
-              <w:t xml:space="preserve">NEXT ROUND → Round 2: all twelve faults land at once, two per sector. Move two TRN workforce tokens physically to the MED table (F-207’s injury). START. Announce in-world: "Core output is fluctuating. Systems are coupling in ways they should not."</w:t>
+              <w:t xml:space="preserve">NEXT ROUND → Round 2, START, then fire the round's twelve faults from the library, two per sector — all at once for the full wave, or staggered if the room is behind. Move two TRN workforce tokens physically to the MED table (F-207’s injury). START. Announce in-world: "Core output is fluctuating. Systems are coupling in ways they should not."</w:t>
             </w:r>
           </w:p>
         </w:tc>
@@ -7105,7 +7105,7 @@
               <w:rPr>
                 <w:rFonts w:ascii="Arial" w:cs="Arial" w:eastAsia="Arial" w:hAnsi="Arial"/>
               </w:rPr>
-              <w:t xml:space="preserve">No button — this wave is inside Round 2. Nothing new is scripted: the twelve faults are already on the tables.</w:t>
+              <w:t xml:space="preserve">No button — this wave is inside Round 2. Nothing new is scripted; whatever of the twelve you fired is still on the tables.</w:t>
             </w:r>
           </w:p>
         </w:tc>
@@ -7450,7 +7450,7 @@
               <w:rPr>
                 <w:rFonts w:ascii="Arial" w:cs="Arial" w:eastAsia="Arial" w:hAnsi="Arial"/>
               </w:rPr>
-              <w:t xml:space="preserve">NEXT ROUND → Round 3: its six critical faults land at once, one per sector, two specs each. START. Announce: "Core integrity is falling. Assume nothing is routine."</w:t>
+              <w:t xml:space="preserve">NEXT ROUND → Round 3. START, then fire its six critical faults from the library, one per sector, two specs each. Announce: "Core integrity is falling. Assume nothing is routine."</w:t>
             </w:r>
           </w:p>
         </w:tc>
@@ -8440,7 +8440,7 @@
               <w:rPr>
                 <w:rFonts w:ascii="Arial" w:cs="Arial" w:eastAsia="Arial" w:hAnsi="Arial"/>
               </w:rPr>
-              <w:t xml:space="preserve">NEXT ROUND → Round 4: its six faults land at once, each needing another sector’s buried appendix. START. Announce in-world: "Seismic activity detected." Restore brownout sectors to active.</w:t>
+              <w:t xml:space="preserve">NEXT ROUND → Round 4. START, then fire its six faults from the library, each needing another sector’s buried appendix. Announce in-world: "Seismic activity detected." Restore brownout sectors to active.</w:t>
             </w:r>
           </w:p>
         </w:tc>

</xml_diff>